<commit_message>
Redact PII inside embedded images (OCR, ID-card rules, faces, QR)
</commit_message>
<xml_diff>
--- a/output/Evaluation_Report.docx
+++ b/output/Evaluation_Report.docx
@@ -93,10 +93,24 @@
         <w:rPr>
           <w:b/>
         </w:rPr>
+        <w:t xml:space="preserve">Images: </w:t>
+      </w:r>
+      <w:r>
+        <w:t>the prospectus embeds a PAN card and an Aadhaar card as photographs. OCR-based redaction covers all 9 text fields OCR could read on them, pixelates both faces and blanks both QR codes (section 3.5).</w:t>
+      </w:r>
+    </w:p>
+    <w:p>
+      <w:pPr>
+        <w:pStyle w:val="ListBullet"/>
+      </w:pPr>
+      <w:r>
+        <w:rPr>
+          <w:b/>
+        </w:rPr>
         <w:t xml:space="preserve">End to end: </w:t>
       </w:r>
       <w:r>
-        <w:t>1 of 44 test PII strings survive in the output file; 0 inconsistent replacements out of 849; format preserved for 164/164 phones/emails/IDs; runtime 5.9 s for 126 pages.</w:t>
+        <w:t>1 of 44 test PII strings survive in the output file; 0 inconsistent replacements out of 849; format preserved for 164/164 phones/emails/IDs; runtime 22.9 s for 126 pages.</w:t>
       </w:r>
     </w:p>
     <w:p>
@@ -4187,13 +4201,705 @@
               <w:rPr>
                 <w:sz w:val="18"/>
               </w:rPr>
-              <w:t>5.9 s for the 126-page document</w:t>
+              <w:t>22.9 s for the 126-page document</w:t>
             </w:r>
           </w:p>
         </w:tc>
       </w:tr>
     </w:tbl>
     <w:p/>
+    <w:p>
+      <w:pPr>
+        <w:pStyle w:val="Heading2"/>
+      </w:pPr>
+      <w:r>
+        <w:rPr>
+          <w:color w:val="1F2937"/>
+        </w:rPr>
+        <w:t>3.5 Pictures inside the document</w:t>
+      </w:r>
+    </w:p>
+    <w:p>
+      <w:r>
+        <w:rPr>
+          <w:i w:val="0"/>
+        </w:rPr>
+        <w:t>The prospectus contains 8 embedded images, including two identity-card photographs (a PAN card and an Aadhaar card) that carry names, father's names, dates of birth, ID numbers, an address, photos, QR codes and a handwritten signature. None of that is text, so the text pipeline cannot see it. Images are handled separately: OCR (RapidOCR) reads each picture, the same detectors plus ID-card layout rules find PII in the OCR text, matching regions are covered with black boxes, faces are pixelated, QR codes are blanked, and the document's hidden page-one thumbnail is removed. A photograph cannot be given a believable fake value the way text can, so blanking is used instead of replacement.</w:t>
+      </w:r>
+    </w:p>
+    <w:tbl>
+      <w:tblPr>
+        <w:tblStyle w:val="LightGrid-Accent1"/>
+        <w:tblW w:type="auto" w:w="0"/>
+        <w:tblLayout w:type="fixed"/>
+        <w:tblLook w:firstColumn="1" w:firstRow="1" w:lastColumn="0" w:lastRow="0" w:noHBand="0" w:noVBand="1" w:val="04A0"/>
+      </w:tblPr>
+      <w:tblGrid>
+        <w:gridCol w:w="2160"/>
+        <w:gridCol w:w="2160"/>
+        <w:gridCol w:w="2160"/>
+        <w:gridCol w:w="2160"/>
+      </w:tblGrid>
+      <w:tr>
+        <w:tc>
+          <w:tcPr>
+            <w:tcW w:type="dxa" w:w="1728"/>
+          </w:tcPr>
+          <w:p>
+            <w:r>
+              <w:rPr>
+                <w:b/>
+                <w:sz w:val="18"/>
+              </w:rPr>
+              <w:t>Card</w:t>
+            </w:r>
+          </w:p>
+        </w:tc>
+        <w:tc>
+          <w:tcPr>
+            <w:tcW w:type="dxa" w:w="3312"/>
+          </w:tcPr>
+          <w:p>
+            <w:r>
+              <w:rPr>
+                <w:b/>
+                <w:sz w:val="18"/>
+              </w:rPr>
+              <w:t>Field</w:t>
+            </w:r>
+          </w:p>
+        </w:tc>
+        <w:tc>
+          <w:tcPr>
+            <w:tcW w:type="dxa" w:w="2304"/>
+          </w:tcPr>
+          <w:p>
+            <w:r>
+              <w:rPr>
+                <w:b/>
+                <w:sz w:val="18"/>
+              </w:rPr>
+              <w:t>OCR-readable before</w:t>
+            </w:r>
+          </w:p>
+        </w:tc>
+        <w:tc>
+          <w:tcPr>
+            <w:tcW w:type="dxa" w:w="2304"/>
+          </w:tcPr>
+          <w:p>
+            <w:r>
+              <w:rPr>
+                <w:b/>
+                <w:sz w:val="18"/>
+              </w:rPr>
+              <w:t>OCR-readable after</w:t>
+            </w:r>
+          </w:p>
+        </w:tc>
+      </w:tr>
+      <w:tr>
+        <w:tc>
+          <w:tcPr>
+            <w:tcW w:type="dxa" w:w="1728"/>
+          </w:tcPr>
+          <w:p>
+            <w:r>
+              <w:rPr>
+                <w:sz w:val="18"/>
+              </w:rPr>
+              <w:t>image4.png</w:t>
+            </w:r>
+          </w:p>
+        </w:tc>
+        <w:tc>
+          <w:tcPr>
+            <w:tcW w:type="dxa" w:w="3312"/>
+          </w:tcPr>
+          <w:p>
+            <w:r>
+              <w:rPr>
+                <w:sz w:val="18"/>
+              </w:rPr>
+              <w:t>PAN number</w:t>
+            </w:r>
+          </w:p>
+        </w:tc>
+        <w:tc>
+          <w:tcPr>
+            <w:tcW w:type="dxa" w:w="2304"/>
+          </w:tcPr>
+          <w:p>
+            <w:r>
+              <w:rPr>
+                <w:sz w:val="18"/>
+              </w:rPr>
+              <w:t>yes</w:t>
+            </w:r>
+          </w:p>
+        </w:tc>
+        <w:tc>
+          <w:tcPr>
+            <w:tcW w:type="dxa" w:w="2304"/>
+          </w:tcPr>
+          <w:p>
+            <w:r>
+              <w:rPr>
+                <w:sz w:val="18"/>
+              </w:rPr>
+              <w:t>no</w:t>
+            </w:r>
+          </w:p>
+        </w:tc>
+      </w:tr>
+      <w:tr>
+        <w:tc>
+          <w:tcPr>
+            <w:tcW w:type="dxa" w:w="1728"/>
+          </w:tcPr>
+          <w:p>
+            <w:r>
+              <w:rPr>
+                <w:sz w:val="18"/>
+              </w:rPr>
+              <w:t>image4.png</w:t>
+            </w:r>
+          </w:p>
+        </w:tc>
+        <w:tc>
+          <w:tcPr>
+            <w:tcW w:type="dxa" w:w="3312"/>
+          </w:tcPr>
+          <w:p>
+            <w:r>
+              <w:rPr>
+                <w:sz w:val="18"/>
+              </w:rPr>
+              <w:t>Name</w:t>
+            </w:r>
+          </w:p>
+        </w:tc>
+        <w:tc>
+          <w:tcPr>
+            <w:tcW w:type="dxa" w:w="2304"/>
+          </w:tcPr>
+          <w:p>
+            <w:r>
+              <w:rPr>
+                <w:sz w:val="18"/>
+              </w:rPr>
+              <w:t>yes</w:t>
+            </w:r>
+          </w:p>
+        </w:tc>
+        <w:tc>
+          <w:tcPr>
+            <w:tcW w:type="dxa" w:w="2304"/>
+          </w:tcPr>
+          <w:p>
+            <w:r>
+              <w:rPr>
+                <w:sz w:val="18"/>
+              </w:rPr>
+              <w:t>no</w:t>
+            </w:r>
+          </w:p>
+        </w:tc>
+      </w:tr>
+      <w:tr>
+        <w:tc>
+          <w:tcPr>
+            <w:tcW w:type="dxa" w:w="1728"/>
+          </w:tcPr>
+          <w:p>
+            <w:r>
+              <w:rPr>
+                <w:sz w:val="18"/>
+              </w:rPr>
+              <w:t>image4.png</w:t>
+            </w:r>
+          </w:p>
+        </w:tc>
+        <w:tc>
+          <w:tcPr>
+            <w:tcW w:type="dxa" w:w="3312"/>
+          </w:tcPr>
+          <w:p>
+            <w:r>
+              <w:rPr>
+                <w:sz w:val="18"/>
+              </w:rPr>
+              <w:t>Father's name</w:t>
+            </w:r>
+          </w:p>
+        </w:tc>
+        <w:tc>
+          <w:tcPr>
+            <w:tcW w:type="dxa" w:w="2304"/>
+          </w:tcPr>
+          <w:p>
+            <w:r>
+              <w:rPr>
+                <w:sz w:val="18"/>
+              </w:rPr>
+              <w:t>yes</w:t>
+            </w:r>
+          </w:p>
+        </w:tc>
+        <w:tc>
+          <w:tcPr>
+            <w:tcW w:type="dxa" w:w="2304"/>
+          </w:tcPr>
+          <w:p>
+            <w:r>
+              <w:rPr>
+                <w:sz w:val="18"/>
+              </w:rPr>
+              <w:t>no</w:t>
+            </w:r>
+          </w:p>
+        </w:tc>
+      </w:tr>
+      <w:tr>
+        <w:tc>
+          <w:tcPr>
+            <w:tcW w:type="dxa" w:w="1728"/>
+          </w:tcPr>
+          <w:p>
+            <w:r>
+              <w:rPr>
+                <w:sz w:val="18"/>
+              </w:rPr>
+              <w:t>image4.png</w:t>
+            </w:r>
+          </w:p>
+        </w:tc>
+        <w:tc>
+          <w:tcPr>
+            <w:tcW w:type="dxa" w:w="3312"/>
+          </w:tcPr>
+          <w:p>
+            <w:r>
+              <w:rPr>
+                <w:sz w:val="18"/>
+              </w:rPr>
+              <w:t>Date of birth</w:t>
+            </w:r>
+          </w:p>
+        </w:tc>
+        <w:tc>
+          <w:tcPr>
+            <w:tcW w:type="dxa" w:w="2304"/>
+          </w:tcPr>
+          <w:p>
+            <w:r>
+              <w:rPr>
+                <w:sz w:val="18"/>
+              </w:rPr>
+              <w:t>yes</w:t>
+            </w:r>
+          </w:p>
+        </w:tc>
+        <w:tc>
+          <w:tcPr>
+            <w:tcW w:type="dxa" w:w="2304"/>
+          </w:tcPr>
+          <w:p>
+            <w:r>
+              <w:rPr>
+                <w:sz w:val="18"/>
+              </w:rPr>
+              <w:t>no</w:t>
+            </w:r>
+          </w:p>
+        </w:tc>
+      </w:tr>
+      <w:tr>
+        <w:tc>
+          <w:tcPr>
+            <w:tcW w:type="dxa" w:w="1728"/>
+          </w:tcPr>
+          <w:p>
+            <w:r>
+              <w:rPr>
+                <w:sz w:val="18"/>
+              </w:rPr>
+              <w:t>image5.png</w:t>
+            </w:r>
+          </w:p>
+        </w:tc>
+        <w:tc>
+          <w:tcPr>
+            <w:tcW w:type="dxa" w:w="3312"/>
+          </w:tcPr>
+          <w:p>
+            <w:r>
+              <w:rPr>
+                <w:sz w:val="18"/>
+              </w:rPr>
+              <w:t>Name</w:t>
+            </w:r>
+          </w:p>
+        </w:tc>
+        <w:tc>
+          <w:tcPr>
+            <w:tcW w:type="dxa" w:w="2304"/>
+          </w:tcPr>
+          <w:p>
+            <w:r>
+              <w:rPr>
+                <w:sz w:val="18"/>
+              </w:rPr>
+              <w:t>yes</w:t>
+            </w:r>
+          </w:p>
+        </w:tc>
+        <w:tc>
+          <w:tcPr>
+            <w:tcW w:type="dxa" w:w="2304"/>
+          </w:tcPr>
+          <w:p>
+            <w:r>
+              <w:rPr>
+                <w:sz w:val="18"/>
+              </w:rPr>
+              <w:t>no</w:t>
+            </w:r>
+          </w:p>
+        </w:tc>
+      </w:tr>
+      <w:tr>
+        <w:tc>
+          <w:tcPr>
+            <w:tcW w:type="dxa" w:w="1728"/>
+          </w:tcPr>
+          <w:p>
+            <w:r>
+              <w:rPr>
+                <w:sz w:val="18"/>
+              </w:rPr>
+              <w:t>image5.png</w:t>
+            </w:r>
+          </w:p>
+        </w:tc>
+        <w:tc>
+          <w:tcPr>
+            <w:tcW w:type="dxa" w:w="3312"/>
+          </w:tcPr>
+          <w:p>
+            <w:r>
+              <w:rPr>
+                <w:sz w:val="18"/>
+              </w:rPr>
+              <w:t>Father's name</w:t>
+            </w:r>
+          </w:p>
+        </w:tc>
+        <w:tc>
+          <w:tcPr>
+            <w:tcW w:type="dxa" w:w="2304"/>
+          </w:tcPr>
+          <w:p>
+            <w:r>
+              <w:rPr>
+                <w:sz w:val="18"/>
+              </w:rPr>
+              <w:t>yes</w:t>
+            </w:r>
+          </w:p>
+        </w:tc>
+        <w:tc>
+          <w:tcPr>
+            <w:tcW w:type="dxa" w:w="2304"/>
+          </w:tcPr>
+          <w:p>
+            <w:r>
+              <w:rPr>
+                <w:sz w:val="18"/>
+              </w:rPr>
+              <w:t>no</w:t>
+            </w:r>
+          </w:p>
+        </w:tc>
+      </w:tr>
+      <w:tr>
+        <w:tc>
+          <w:tcPr>
+            <w:tcW w:type="dxa" w:w="1728"/>
+          </w:tcPr>
+          <w:p>
+            <w:r>
+              <w:rPr>
+                <w:sz w:val="18"/>
+              </w:rPr>
+              <w:t>image5.png</w:t>
+            </w:r>
+          </w:p>
+        </w:tc>
+        <w:tc>
+          <w:tcPr>
+            <w:tcW w:type="dxa" w:w="3312"/>
+          </w:tcPr>
+          <w:p>
+            <w:r>
+              <w:rPr>
+                <w:sz w:val="18"/>
+              </w:rPr>
+              <w:t>Date of birth</w:t>
+            </w:r>
+          </w:p>
+        </w:tc>
+        <w:tc>
+          <w:tcPr>
+            <w:tcW w:type="dxa" w:w="2304"/>
+          </w:tcPr>
+          <w:p>
+            <w:r>
+              <w:rPr>
+                <w:sz w:val="18"/>
+              </w:rPr>
+              <w:t>yes</w:t>
+            </w:r>
+          </w:p>
+        </w:tc>
+        <w:tc>
+          <w:tcPr>
+            <w:tcW w:type="dxa" w:w="2304"/>
+          </w:tcPr>
+          <w:p>
+            <w:r>
+              <w:rPr>
+                <w:sz w:val="18"/>
+              </w:rPr>
+              <w:t>no</w:t>
+            </w:r>
+          </w:p>
+        </w:tc>
+      </w:tr>
+      <w:tr>
+        <w:tc>
+          <w:tcPr>
+            <w:tcW w:type="dxa" w:w="1728"/>
+          </w:tcPr>
+          <w:p>
+            <w:r>
+              <w:rPr>
+                <w:sz w:val="18"/>
+              </w:rPr>
+              <w:t>image5.png</w:t>
+            </w:r>
+          </w:p>
+        </w:tc>
+        <w:tc>
+          <w:tcPr>
+            <w:tcW w:type="dxa" w:w="3312"/>
+          </w:tcPr>
+          <w:p>
+            <w:r>
+              <w:rPr>
+                <w:sz w:val="18"/>
+              </w:rPr>
+              <w:t>Aadhaar number (front)</w:t>
+            </w:r>
+          </w:p>
+        </w:tc>
+        <w:tc>
+          <w:tcPr>
+            <w:tcW w:type="dxa" w:w="2304"/>
+          </w:tcPr>
+          <w:p>
+            <w:r>
+              <w:rPr>
+                <w:sz w:val="18"/>
+              </w:rPr>
+              <w:t>yes</w:t>
+            </w:r>
+          </w:p>
+        </w:tc>
+        <w:tc>
+          <w:tcPr>
+            <w:tcW w:type="dxa" w:w="2304"/>
+          </w:tcPr>
+          <w:p>
+            <w:r>
+              <w:rPr>
+                <w:sz w:val="18"/>
+              </w:rPr>
+              <w:t>no</w:t>
+            </w:r>
+          </w:p>
+        </w:tc>
+      </w:tr>
+      <w:tr>
+        <w:tc>
+          <w:tcPr>
+            <w:tcW w:type="dxa" w:w="1728"/>
+          </w:tcPr>
+          <w:p>
+            <w:r>
+              <w:rPr>
+                <w:sz w:val="18"/>
+              </w:rPr>
+              <w:t>image5.png</w:t>
+            </w:r>
+          </w:p>
+        </w:tc>
+        <w:tc>
+          <w:tcPr>
+            <w:tcW w:type="dxa" w:w="3312"/>
+          </w:tcPr>
+          <w:p>
+            <w:r>
+              <w:rPr>
+                <w:sz w:val="18"/>
+              </w:rPr>
+              <w:t>Address (locality)</w:t>
+            </w:r>
+          </w:p>
+        </w:tc>
+        <w:tc>
+          <w:tcPr>
+            <w:tcW w:type="dxa" w:w="2304"/>
+          </w:tcPr>
+          <w:p>
+            <w:r>
+              <w:rPr>
+                <w:sz w:val="18"/>
+              </w:rPr>
+              <w:t>no</w:t>
+            </w:r>
+          </w:p>
+        </w:tc>
+        <w:tc>
+          <w:tcPr>
+            <w:tcW w:type="dxa" w:w="2304"/>
+          </w:tcPr>
+          <w:p>
+            <w:r>
+              <w:rPr>
+                <w:sz w:val="18"/>
+              </w:rPr>
+              <w:t>no</w:t>
+            </w:r>
+          </w:p>
+        </w:tc>
+      </w:tr>
+      <w:tr>
+        <w:tc>
+          <w:tcPr>
+            <w:tcW w:type="dxa" w:w="1728"/>
+          </w:tcPr>
+          <w:p>
+            <w:r>
+              <w:rPr>
+                <w:sz w:val="18"/>
+              </w:rPr>
+              <w:t>image5.png</w:t>
+            </w:r>
+          </w:p>
+        </w:tc>
+        <w:tc>
+          <w:tcPr>
+            <w:tcW w:type="dxa" w:w="3312"/>
+          </w:tcPr>
+          <w:p>
+            <w:r>
+              <w:rPr>
+                <w:sz w:val="18"/>
+              </w:rPr>
+              <w:t>Address (PIN)</w:t>
+            </w:r>
+          </w:p>
+        </w:tc>
+        <w:tc>
+          <w:tcPr>
+            <w:tcW w:type="dxa" w:w="2304"/>
+          </w:tcPr>
+          <w:p>
+            <w:r>
+              <w:rPr>
+                <w:sz w:val="18"/>
+              </w:rPr>
+              <w:t>yes</w:t>
+            </w:r>
+          </w:p>
+        </w:tc>
+        <w:tc>
+          <w:tcPr>
+            <w:tcW w:type="dxa" w:w="2304"/>
+          </w:tcPr>
+          <w:p>
+            <w:r>
+              <w:rPr>
+                <w:sz w:val="18"/>
+              </w:rPr>
+              <w:t>no</w:t>
+            </w:r>
+          </w:p>
+        </w:tc>
+      </w:tr>
+    </w:tbl>
+    <w:p/>
+    <w:p>
+      <w:r>
+        <w:drawing>
+          <wp:inline xmlns:a="http://schemas.openxmlformats.org/drawingml/2006/main" xmlns:pic="http://schemas.openxmlformats.org/drawingml/2006/picture">
+            <wp:extent cx="5760720" cy="3322015"/>
+            <wp:docPr id="3" name="Picture 3"/>
+            <wp:cNvGraphicFramePr>
+              <a:graphicFrameLocks noChangeAspect="1"/>
+            </wp:cNvGraphicFramePr>
+            <a:graphic>
+              <a:graphicData uri="http://schemas.openxmlformats.org/drawingml/2006/picture">
+                <pic:pic>
+                  <pic:nvPicPr>
+                    <pic:cNvPr id="0" name="fig_images_redacted.png"/>
+                    <pic:cNvPicPr/>
+                  </pic:nvPicPr>
+                  <pic:blipFill>
+                    <a:blip r:embed="rId11"/>
+                    <a:stretch>
+                      <a:fillRect/>
+                    </a:stretch>
+                  </pic:blipFill>
+                  <pic:spPr>
+                    <a:xfrm>
+                      <a:off x="0" y="0"/>
+                      <a:ext cx="5760720" cy="3322015"/>
+                    </a:xfrm>
+                    <a:prstGeom prst="rect"/>
+                  </pic:spPr>
+                </pic:pic>
+              </a:graphicData>
+            </a:graphic>
+          </wp:inline>
+        </w:drawing>
+      </w:r>
+    </w:p>
+    <w:p>
+      <w:r>
+        <w:rPr>
+          <w:i/>
+        </w:rPr>
+        <w:t>The two ID-card images as they appear in output/redacted.docx (only the redacted versions are shown here on purpose).</w:t>
+      </w:r>
+    </w:p>
+    <w:p>
+      <w:r>
+        <w:rPr>
+          <w:i/>
+        </w:rPr>
+        <w:t>Result: 9 of 9 text fields that OCR could read in the originals can no longer be read after redaction; faces detected fell from 2 to 0. By eye, both QR codes, both photos and the PAN card's handwritten signature are covered. One field ('Address (locality)') was never readable by OCR in the original so it does not count in the score, although the address block is covered by layout rule.</w:t>
+      </w:r>
+    </w:p>
+    <w:p>
+      <w:r>
+        <w:rPr>
+          <w:i w:val="0"/>
+        </w:rPr>
+        <w:t>Caveats: this is a proxy (machine readability, not a human reading a partly covered word); the ID rules were developed on these two cards, so the result is in-sample; OCR cannot read Devanagari or handwriting (the Hindi lines above each name are covered by position, not by reading them); a low-resolution photographed QR is found by a texture heuristic, not decoded; and the tax office's own printed address on the PAN card's back is partly covered too, which is over-redaction.</w:t>
+      </w:r>
+    </w:p>
     <w:p>
       <w:pPr>
         <w:pStyle w:val="Heading1"/>
@@ -4756,7 +5462,7 @@
         <w:pStyle w:val="ListBullet"/>
       </w:pPr>
       <w:r>
-        <w:t>Only the prospectus's own text is scored. Images (the cover QR code and logos) can carry names and are not processed.</w:t>
+        <w:t>The text metrics score the prospectus's text only. Images are evaluated separately in section 3.5, on two cards, in-sample.</w:t>
       </w:r>
     </w:p>
     <w:p>

</xml_diff>